<commit_message>
Agrega evidencias individuales de Uciell Madrid y corrige autoevaluaciones
- Nuevas: Uciell_Madrid_1.1 (autoevaluacion, 25 asignaturas de su malla)
  y Uciell_Madrid_1.2 (diario de reflexion).
- Corrige en ambas autoevaluaciones el estado de las asignaturas de
  desarrollo movil: Programacion de Aplicaciones Moviles en curso y
  Desarrollo de Aplicaciones Moviles reprobada.
- Retira el Anexo1 de Evidencias Grupales para dejar solo los tres
  entregables solicitados.
- Actualiza el README con la estructura definitiva.

Co-Authored-By: Claude Opus 5 <noreply@anthropic.com>
</commit_message>
<xml_diff>
--- a/Fase 1/Evidencias Individuales/Katalina_Mora_1.1_APT122_AutoevaluacionCompetenciasFase1.docx
+++ b/Fase 1/Evidencias Individuales/Katalina_Mora_1.1_APT122_AutoevaluacionCompetenciasFase1.docx
@@ -2807,7 +2807,7 @@
                 <w:b/>
                 <w:sz w:val="20"/>
               </w:rPr>
-              <w:t>PGY4121 – Programación de Aplicaciones</w:t>
+              <w:t>PGY4121 – Programación de Aplicaciones Móviles</w:t>
             </w:r>
           </w:p>
         </w:tc>
@@ -2825,6 +2825,12 @@
                 <w:szCs w:val="18"/>
               </w:rPr>
             </w:pPr>
+            <w:r>
+              <w:rPr>
+                <w:b w:val="0"/>
+                <w:sz w:val="20"/>
+              </w:rPr>
+            </w:r>
           </w:p>
         </w:tc>
         <w:tc>
@@ -2841,6 +2847,12 @@
                 <w:szCs w:val="18"/>
               </w:rPr>
             </w:pPr>
+            <w:r>
+              <w:rPr>
+                <w:b w:val="0"/>
+                <w:sz w:val="20"/>
+              </w:rPr>
+            </w:r>
           </w:p>
         </w:tc>
         <w:tc>
@@ -2859,6 +2871,29 @@
             </w:pPr>
             <w:r>
               <w:rPr>
+                <w:b w:val="0"/>
+                <w:sz w:val="20"/>
+              </w:rPr>
+            </w:r>
+          </w:p>
+        </w:tc>
+        <w:tc>
+          <w:tcPr>
+            <w:tcW w:w="1187" w:type="dxa"/>
+          </w:tcPr>
+          <w:p>
+            <w:pPr>
+              <w:jc w:val="center"/>
+              <w:rPr>
+                <w:b/>
+                <w:bCs/>
+                <w:sz w:val="18"/>
+                <w:szCs w:val="18"/>
+              </w:rPr>
+            </w:pPr>
+            <w:r>
+              <w:rPr>
+                <w:b w:val="0"/>
                 <w:sz w:val="20"/>
               </w:rPr>
               <w:t>X</w:t>
@@ -2867,22 +2902,6 @@
         </w:tc>
         <w:tc>
           <w:tcPr>
-            <w:tcW w:w="1187" w:type="dxa"/>
-          </w:tcPr>
-          <w:p>
-            <w:pPr>
-              <w:jc w:val="center"/>
-              <w:rPr>
-                <w:b/>
-                <w:bCs/>
-                <w:sz w:val="18"/>
-                <w:szCs w:val="18"/>
-              </w:rPr>
-            </w:pPr>
-          </w:p>
-        </w:tc>
-        <w:tc>
-          <w:tcPr>
             <w:tcW w:w="1250" w:type="dxa"/>
           </w:tcPr>
           <w:p>
@@ -2895,6 +2914,12 @@
                 <w:szCs w:val="18"/>
               </w:rPr>
             </w:pPr>
+            <w:r>
+              <w:rPr>
+                <w:b w:val="0"/>
+                <w:sz w:val="20"/>
+              </w:rPr>
+            </w:r>
           </w:p>
         </w:tc>
         <w:tc>
@@ -2913,16 +2938,10 @@
             </w:pPr>
             <w:r>
               <w:rPr>
-                <w:sz w:val="18"/>
-              </w:rPr>
-              <w:t xml:space="preserve">Actualmente estoy cursando esta asignatura, por lo que mi dominio está en construcción. Aporta directamente a la </w:t>
-            </w:r>
-            <w:r>
-              <w:rPr>
-                <w:sz w:val="18"/>
-              </w:rPr>
-              <w:lastRenderedPageBreak/>
-              <w:t>competencia de desarrollo de soluciones de software de mi perfil de egreso.</w:t>
+                <w:b w:val="0"/>
+                <w:sz w:val="18"/>
+              </w:rPr>
+              <w:t>La estoy cursando actualmente, trabajando con Kotlin y Android Studio. Mi dominio está en construcción y es la asignatura a la que le dedico más tiempo fuera de clases, porque el desarrollo móvil es mi área más débil y quiero cerrar esa brecha este semestre.</w:t>
             </w:r>
           </w:p>
         </w:tc>
@@ -4773,6 +4792,12 @@
                 <w:szCs w:val="18"/>
               </w:rPr>
             </w:pPr>
+            <w:r>
+              <w:rPr>
+                <w:b w:val="0"/>
+                <w:sz w:val="20"/>
+              </w:rPr>
+            </w:r>
           </w:p>
         </w:tc>
         <w:tc>
@@ -4789,6 +4814,12 @@
                 <w:szCs w:val="18"/>
               </w:rPr>
             </w:pPr>
+            <w:r>
+              <w:rPr>
+                <w:b w:val="0"/>
+                <w:sz w:val="20"/>
+              </w:rPr>
+            </w:r>
           </w:p>
         </w:tc>
         <w:tc>
@@ -4807,10 +4838,52 @@
             </w:pPr>
             <w:r>
               <w:rPr>
-                <w:b/>
-                <w:bCs/>
-                <w:sz w:val="18"/>
-                <w:szCs w:val="18"/>
+                <w:b w:val="0"/>
+                <w:sz w:val="20"/>
+              </w:rPr>
+            </w:r>
+          </w:p>
+        </w:tc>
+        <w:tc>
+          <w:tcPr>
+            <w:tcW w:w="1187" w:type="dxa"/>
+          </w:tcPr>
+          <w:p>
+            <w:pPr>
+              <w:jc w:val="center"/>
+              <w:rPr>
+                <w:b/>
+                <w:bCs/>
+                <w:sz w:val="18"/>
+                <w:szCs w:val="18"/>
+              </w:rPr>
+            </w:pPr>
+            <w:r>
+              <w:rPr>
+                <w:b w:val="0"/>
+                <w:sz w:val="20"/>
+              </w:rPr>
+            </w:r>
+          </w:p>
+        </w:tc>
+        <w:tc>
+          <w:tcPr>
+            <w:tcW w:w="1250" w:type="dxa"/>
+          </w:tcPr>
+          <w:p>
+            <w:pPr>
+              <w:jc w:val="center"/>
+              <w:rPr>
+                <w:b/>
+                <w:bCs/>
+                <w:sz w:val="18"/>
+                <w:szCs w:val="18"/>
+              </w:rPr>
+            </w:pPr>
+            <w:r>
+              <w:rPr>
+                <w:b w:val="0"/>
+                <w:sz w:val="20"/>
               </w:rPr>
               <w:t>X</w:t>
             </w:r>
@@ -4818,38 +4891,6 @@
         </w:tc>
         <w:tc>
           <w:tcPr>
-            <w:tcW w:w="1187" w:type="dxa"/>
-          </w:tcPr>
-          <w:p>
-            <w:pPr>
-              <w:jc w:val="center"/>
-              <w:rPr>
-                <w:b/>
-                <w:bCs/>
-                <w:sz w:val="18"/>
-                <w:szCs w:val="18"/>
-              </w:rPr>
-            </w:pPr>
-          </w:p>
-        </w:tc>
-        <w:tc>
-          <w:tcPr>
-            <w:tcW w:w="1250" w:type="dxa"/>
-          </w:tcPr>
-          <w:p>
-            <w:pPr>
-              <w:jc w:val="center"/>
-              <w:rPr>
-                <w:b/>
-                <w:bCs/>
-                <w:sz w:val="18"/>
-                <w:szCs w:val="18"/>
-              </w:rPr>
-            </w:pPr>
-          </w:p>
-        </w:tc>
-        <w:tc>
-          <w:tcPr>
             <w:tcW w:w="2557" w:type="dxa"/>
           </w:tcPr>
           <w:p>
@@ -4863,15 +4904,10 @@
             </w:pPr>
             <w:r>
               <w:rPr>
-                <w:sz w:val="18"/>
-              </w:rPr>
-              <w:t>Actualmente estoy cursando esta asignatura,</w:t>
-            </w:r>
-            <w:r>
-              <w:rPr>
-                <w:sz w:val="18"/>
-              </w:rPr>
-              <w:t xml:space="preserve"> Estoy trabajando por mi cuenta con Kotlin y Android Studio para nivelar la base antes de retomarla. Es mi principal oportunidad de mejora y la tengo identificada como tal.</w:t>
+                <w:b w:val="0"/>
+                <w:sz w:val="18"/>
+              </w:rPr>
+              <w:t>Reprobé esta asignatura y debo recursarla. Es mi principal oportunidad de mejora y la tengo identificada como tal. Estoy nivelando esa base a través de Programación de Aplicaciones Móviles, que curso este semestre con Kotlin y Android Studio.</w:t>
             </w:r>
           </w:p>
         </w:tc>

</xml_diff>